<commit_message>
Add new figures to Word file
</commit_message>
<xml_diff>
--- a/LakeMeadWaterConservationProgramAnalysis/LakeMeadWaterConservationProgramSuccessChallengesSuggestions_v2.docx
+++ b/LakeMeadWaterConservationProgramAnalysis/LakeMeadWaterConservationProgramSuccessChallengesSuggestions_v2.docx
@@ -4520,10 +4520,10 @@
                 <w:noProof/>
               </w:rPr>
               <w:drawing>
-                <wp:inline distT="0" distB="0" distL="0" distR="0" wp14:anchorId="4D30B906" wp14:editId="4A49C23D">
-                  <wp:extent cx="3007565" cy="1971304"/>
-                  <wp:effectExtent l="0" t="0" r="2540" b="0"/>
-                  <wp:docPr id="457550776" name="Picture 1" descr="A graph with blue bars&#10;&#10;Description automatically generated"/>
+                <wp:inline distT="0" distB="0" distL="0" distR="0" wp14:anchorId="61E4875B" wp14:editId="0A1A40F2">
+                  <wp:extent cx="2967762" cy="1901952"/>
+                  <wp:effectExtent l="0" t="0" r="4445" b="3175"/>
+                  <wp:docPr id="1919003903" name="Picture 1"/>
                   <wp:cNvGraphicFramePr>
                     <a:graphicFrameLocks xmlns:a="http://schemas.openxmlformats.org/drawingml/2006/main" noChangeAspect="1"/>
                   </wp:cNvGraphicFramePr>
@@ -4531,7 +4531,7 @@
                     <a:graphicData uri="http://schemas.openxmlformats.org/drawingml/2006/picture">
                       <pic:pic xmlns:pic="http://schemas.openxmlformats.org/drawingml/2006/picture">
                         <pic:nvPicPr>
-                          <pic:cNvPr id="457550776" name="Picture 1" descr="A graph with blue bars&#10;&#10;Description automatically generated"/>
+                          <pic:cNvPr id="1919003903" name=""/>
                           <pic:cNvPicPr/>
                         </pic:nvPicPr>
                         <pic:blipFill>
@@ -4543,7 +4543,7 @@
                         <pic:spPr>
                           <a:xfrm>
                             <a:off x="0" y="0"/>
-                            <a:ext cx="3041905" cy="1993812"/>
+                            <a:ext cx="2972486" cy="1904979"/>
                           </a:xfrm>
                           <a:prstGeom prst="rect">
                             <a:avLst/>
@@ -4724,10 +4724,10 @@
                 <w:noProof/>
               </w:rPr>
               <w:drawing>
-                <wp:inline distT="0" distB="0" distL="0" distR="0" wp14:anchorId="6B5E7B78" wp14:editId="58C92EDA">
-                  <wp:extent cx="2973717" cy="1971040"/>
+                <wp:inline distT="0" distB="0" distL="0" distR="0" wp14:anchorId="3956BFFB" wp14:editId="500FC6C4">
+                  <wp:extent cx="3055620" cy="1985010"/>
                   <wp:effectExtent l="0" t="0" r="0" b="0"/>
-                  <wp:docPr id="726890101" name="Picture 1" descr="A graph of different colored bars&#10;&#10;Description automatically generated with medium confidence"/>
+                  <wp:docPr id="2027020092" name="Picture 1"/>
                   <wp:cNvGraphicFramePr>
                     <a:graphicFrameLocks xmlns:a="http://schemas.openxmlformats.org/drawingml/2006/main" noChangeAspect="1"/>
                   </wp:cNvGraphicFramePr>
@@ -4735,7 +4735,7 @@
                     <a:graphicData uri="http://schemas.openxmlformats.org/drawingml/2006/picture">
                       <pic:pic xmlns:pic="http://schemas.openxmlformats.org/drawingml/2006/picture">
                         <pic:nvPicPr>
-                          <pic:cNvPr id="726890101" name="Picture 1" descr="A graph of different colored bars&#10;&#10;Description automatically generated with medium confidence"/>
+                          <pic:cNvPr id="2027020092" name=""/>
                           <pic:cNvPicPr/>
                         </pic:nvPicPr>
                         <pic:blipFill>
@@ -4747,7 +4747,7 @@
                         <pic:spPr>
                           <a:xfrm>
                             <a:off x="0" y="0"/>
-                            <a:ext cx="3026982" cy="2006345"/>
+                            <a:ext cx="3055620" cy="1985010"/>
                           </a:xfrm>
                           <a:prstGeom prst="rect">
                             <a:avLst/>
@@ -5915,11 +5915,12 @@
         <w:rPr>
           <w:noProof/>
         </w:rPr>
+        <w:lastRenderedPageBreak/>
         <w:drawing>
-          <wp:inline distT="0" distB="0" distL="0" distR="0" wp14:anchorId="3984C78D" wp14:editId="700661FD">
-            <wp:extent cx="5444836" cy="3401859"/>
-            <wp:effectExtent l="0" t="0" r="3810" b="8255"/>
-            <wp:docPr id="1121567393" name="Picture 1" descr="A graph of water and water&#10;&#10;Description automatically generated"/>
+          <wp:inline distT="0" distB="0" distL="0" distR="0" wp14:anchorId="57C79B56" wp14:editId="0FB793FE">
+            <wp:extent cx="5943600" cy="4328795"/>
+            <wp:effectExtent l="0" t="0" r="0" b="0"/>
+            <wp:docPr id="278026554" name="Picture 1"/>
             <wp:cNvGraphicFramePr>
               <a:graphicFrameLocks xmlns:a="http://schemas.openxmlformats.org/drawingml/2006/main" noChangeAspect="1"/>
             </wp:cNvGraphicFramePr>
@@ -5927,7 +5928,7 @@
               <a:graphicData uri="http://schemas.openxmlformats.org/drawingml/2006/picture">
                 <pic:pic xmlns:pic="http://schemas.openxmlformats.org/drawingml/2006/picture">
                   <pic:nvPicPr>
-                    <pic:cNvPr id="1121567393" name="Picture 1" descr="A graph of water and water&#10;&#10;Description automatically generated"/>
+                    <pic:cNvPr id="278026554" name=""/>
                     <pic:cNvPicPr/>
                   </pic:nvPicPr>
                   <pic:blipFill>
@@ -5939,7 +5940,7 @@
                   <pic:spPr>
                     <a:xfrm>
                       <a:off x="0" y="0"/>
-                      <a:ext cx="5452788" cy="3406827"/>
+                      <a:ext cx="5943600" cy="4328795"/>
                     </a:xfrm>
                     <a:prstGeom prst="rect">
                       <a:avLst/>
@@ -5970,7 +5971,6 @@
           <w:sz w:val="24"/>
           <w:szCs w:val="24"/>
         </w:rPr>
-        <w:lastRenderedPageBreak/>
         <w:t>Figure 3. Lake Mead Storage</w:t>
       </w:r>
       <w:r>
@@ -6439,6 +6439,7 @@
           <w:sz w:val="24"/>
           <w:szCs w:val="24"/>
         </w:rPr>
+        <w:lastRenderedPageBreak/>
         <w:t xml:space="preserve">Motivating additional voluntary water conservation is challenging. </w:t>
       </w:r>
       <w:r>
@@ -6727,10 +6728,10 @@
                                 <w:noProof/>
                               </w:rPr>
                               <w:drawing>
-                                <wp:inline distT="0" distB="0" distL="0" distR="0" wp14:anchorId="36D81B38" wp14:editId="1B98FECD">
-                                  <wp:extent cx="3248388" cy="2198789"/>
-                                  <wp:effectExtent l="0" t="0" r="0" b="0"/>
-                                  <wp:docPr id="1319886578" name="Picture 1" descr="A graph of evaporation and evaporation&#10;&#10;Description automatically generated"/>
+                                <wp:inline distT="0" distB="0" distL="0" distR="0" wp14:anchorId="71B6DF22" wp14:editId="645C22BF">
+                                  <wp:extent cx="3208655" cy="2113915"/>
+                                  <wp:effectExtent l="0" t="0" r="0" b="635"/>
+                                  <wp:docPr id="1887471880" name="Picture 1"/>
                                   <wp:cNvGraphicFramePr>
                                     <a:graphicFrameLocks xmlns:a="http://schemas.openxmlformats.org/drawingml/2006/main" noChangeAspect="1"/>
                                   </wp:cNvGraphicFramePr>
@@ -6738,7 +6739,7 @@
                                     <a:graphicData uri="http://schemas.openxmlformats.org/drawingml/2006/picture">
                                       <pic:pic xmlns:pic="http://schemas.openxmlformats.org/drawingml/2006/picture">
                                         <pic:nvPicPr>
-                                          <pic:cNvPr id="1319886578" name="Picture 1" descr="A graph of evaporation and evaporation&#10;&#10;Description automatically generated"/>
+                                          <pic:cNvPr id="1887471880" name=""/>
                                           <pic:cNvPicPr/>
                                         </pic:nvPicPr>
                                         <pic:blipFill>
@@ -6750,7 +6751,7 @@
                                         <pic:spPr>
                                           <a:xfrm>
                                             <a:off x="0" y="0"/>
-                                            <a:ext cx="3251903" cy="2201168"/>
+                                            <a:ext cx="3208655" cy="2113915"/>
                                           </a:xfrm>
                                           <a:prstGeom prst="rect">
                                             <a:avLst/>
@@ -6804,7 +6805,11 @@
           </mc:Choice>
           <mc:Fallback>
             <w:pict>
-              <v:shape w14:anchorId="0BFD2EC6" id="_x0000_s1027" type="#_x0000_t202" style="position:absolute;left:0;text-align:left;margin-left:206.35pt;margin-top:1.65pt;width:267.75pt;height:235.55pt;z-index:251671552;visibility:visible;mso-wrap-style:square;mso-width-percent:0;mso-height-percent:0;mso-wrap-distance-left:9pt;mso-wrap-distance-top:3.6pt;mso-wrap-distance-right:9pt;mso-wrap-distance-bottom:3.6pt;mso-position-horizontal:absolute;mso-position-horizontal-relative:text;mso-position-vertical:absolute;mso-position-vertical-relative:text;mso-width-percent:0;mso-height-percent:0;mso-width-relative:margin;mso-height-relative:margin;v-text-anchor:top" o:gfxdata="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">
+              <v:shapetype w14:anchorId="0BFD2EC6" id="_x0000_t202" coordsize="21600,21600" o:spt="202" path="m,l,21600r21600,l21600,xe">
+                <v:stroke joinstyle="miter"/>
+                <v:path gradientshapeok="t" o:connecttype="rect"/>
+              </v:shapetype>
+              <v:shape id="_x0000_s1027" type="#_x0000_t202" style="position:absolute;left:0;text-align:left;margin-left:206.35pt;margin-top:1.65pt;width:267.75pt;height:235.55pt;z-index:251671552;visibility:visible;mso-wrap-style:square;mso-width-percent:0;mso-height-percent:0;mso-wrap-distance-left:9pt;mso-wrap-distance-top:3.6pt;mso-wrap-distance-right:9pt;mso-wrap-distance-bottom:3.6pt;mso-position-horizontal:absolute;mso-position-horizontal-relative:text;mso-position-vertical:absolute;mso-position-vertical-relative:text;mso-width-percent:0;mso-height-percent:0;mso-width-relative:margin;mso-height-relative:margin;v-text-anchor:top" o:gfxdata="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">
                 <v:textbox>
                   <w:txbxContent>
                     <w:p>
@@ -6813,10 +6818,10 @@
                           <w:noProof/>
                         </w:rPr>
                         <w:drawing>
-                          <wp:inline distT="0" distB="0" distL="0" distR="0" wp14:anchorId="36D81B38" wp14:editId="1B98FECD">
-                            <wp:extent cx="3248388" cy="2198789"/>
-                            <wp:effectExtent l="0" t="0" r="0" b="0"/>
-                            <wp:docPr id="1319886578" name="Picture 1" descr="A graph of evaporation and evaporation&#10;&#10;Description automatically generated"/>
+                          <wp:inline distT="0" distB="0" distL="0" distR="0" wp14:anchorId="71B6DF22" wp14:editId="645C22BF">
+                            <wp:extent cx="3208655" cy="2113915"/>
+                            <wp:effectExtent l="0" t="0" r="0" b="635"/>
+                            <wp:docPr id="1887471880" name="Picture 1"/>
                             <wp:cNvGraphicFramePr>
                               <a:graphicFrameLocks xmlns:a="http://schemas.openxmlformats.org/drawingml/2006/main" noChangeAspect="1"/>
                             </wp:cNvGraphicFramePr>
@@ -6824,7 +6829,7 @@
                               <a:graphicData uri="http://schemas.openxmlformats.org/drawingml/2006/picture">
                                 <pic:pic xmlns:pic="http://schemas.openxmlformats.org/drawingml/2006/picture">
                                   <pic:nvPicPr>
-                                    <pic:cNvPr id="1319886578" name="Picture 1" descr="A graph of evaporation and evaporation&#10;&#10;Description automatically generated"/>
+                                    <pic:cNvPr id="1887471880" name=""/>
                                     <pic:cNvPicPr/>
                                   </pic:nvPicPr>
                                   <pic:blipFill>
@@ -6836,7 +6841,7 @@
                                   <pic:spPr>
                                     <a:xfrm>
                                       <a:off x="0" y="0"/>
-                                      <a:ext cx="3251903" cy="2201168"/>
+                                      <a:ext cx="3208655" cy="2113915"/>
                                     </a:xfrm>
                                     <a:prstGeom prst="rect">
                                       <a:avLst/>
@@ -7025,16 +7030,7 @@
           <w:sz w:val="24"/>
           <w:szCs w:val="24"/>
         </w:rPr>
-        <w:t xml:space="preserve">to increase their ability to </w:t>
-      </w:r>
-      <w:r>
-        <w:rPr>
-          <w:rFonts w:asciiTheme="majorBidi" w:hAnsiTheme="majorBidi" w:cstheme="majorBidi"/>
-          <w:sz w:val="24"/>
-          <w:szCs w:val="24"/>
-        </w:rPr>
-        <w:lastRenderedPageBreak/>
-        <w:t xml:space="preserve">access conserved water </w:t>
+        <w:t xml:space="preserve">to increase their ability to access conserved water </w:t>
       </w:r>
       <w:r>
         <w:rPr>
@@ -7592,7 +7588,16 @@
           <w:sz w:val="24"/>
           <w:szCs w:val="24"/>
         </w:rPr>
-        <w:t xml:space="preserve"> Century, including environmental water flows and aquatic habitat and tribal water rights. Additionally, some areas of the basin recognize that households should be able to access a minimum level of water supply for health and safety. </w:t>
+        <w:t xml:space="preserve"> Century, including environmental water flows and aquatic habitat </w:t>
+      </w:r>
+      <w:r>
+        <w:rPr>
+          <w:rFonts w:asciiTheme="majorBidi" w:hAnsiTheme="majorBidi" w:cstheme="majorBidi"/>
+          <w:sz w:val="24"/>
+          <w:szCs w:val="24"/>
+        </w:rPr>
+        <w:lastRenderedPageBreak/>
+        <w:t xml:space="preserve">and tribal water rights. Additionally, some areas of the basin recognize that households should be able to access a minimum level of water supply for health and safety. </w:t>
       </w:r>
     </w:p>
     <w:p>
@@ -8177,7 +8182,6 @@
           <w:sz w:val="24"/>
           <w:szCs w:val="24"/>
         </w:rPr>
-        <w:lastRenderedPageBreak/>
         <mc:AlternateContent>
           <mc:Choice Requires="wps">
             <w:drawing>
@@ -10000,7 +10004,18 @@
           <w:sz w:val="24"/>
           <w:szCs w:val="24"/>
         </w:rPr>
-        <w:t>there is no trigger to prohibit debits</w:t>
+        <w:t xml:space="preserve">there is no trigger </w:t>
+      </w:r>
+      <w:r>
+        <w:rPr>
+          <w:rFonts w:asciiTheme="majorBidi" w:hAnsiTheme="majorBidi" w:cstheme="majorBidi"/>
+          <w:i/>
+          <w:iCs/>
+          <w:sz w:val="24"/>
+          <w:szCs w:val="24"/>
+        </w:rPr>
+        <w:lastRenderedPageBreak/>
+        <w:t>to prohibit debits</w:t>
       </w:r>
       <w:r>
         <w:rPr>
@@ -10709,7 +10724,6 @@
         <w:pStyle w:val="Heading1"/>
       </w:pPr>
       <w:r>
-        <w:lastRenderedPageBreak/>
         <w:t xml:space="preserve">Conclusions and </w:t>
       </w:r>
       <w:r>
@@ -11460,6 +11474,7 @@
           <w:sz w:val="24"/>
           <w:szCs w:val="24"/>
         </w:rPr>
+        <w:lastRenderedPageBreak/>
         <w:t xml:space="preserve">Why </w:t>
       </w:r>
       <w:r>
@@ -11799,7 +11814,6 @@
         <w:pStyle w:val="Heading1"/>
       </w:pPr>
       <w:r>
-        <w:lastRenderedPageBreak/>
         <w:t>Appendix A. Estimate Share</w:t>
       </w:r>
       <w:r>
@@ -12282,6 +12296,7 @@
         <w:rPr>
           <w:noProof/>
         </w:rPr>
+        <w:lastRenderedPageBreak/>
         <w:drawing>
           <wp:inline distT="0" distB="0" distL="0" distR="0" wp14:anchorId="3DFF5439" wp14:editId="46D10C37">
             <wp:extent cx="5943600" cy="1592580"/>
@@ -12786,7 +12801,6 @@
           <w:sz w:val="24"/>
           <w:szCs w:val="24"/>
         </w:rPr>
-        <w:lastRenderedPageBreak/>
         <w:t xml:space="preserve">For example, at </w:t>
       </w:r>
       <w:r>
@@ -13325,6 +13339,7 @@
           <w:sz w:val="24"/>
           <w:szCs w:val="24"/>
         </w:rPr>
+        <w:lastRenderedPageBreak/>
         <w:t xml:space="preserve">Nevada and Mexico’s percent shares of the </w:t>
       </w:r>
       <w:r>
@@ -13600,7 +13615,6 @@
         <w:ind w:left="720" w:hanging="720"/>
       </w:pPr>
       <w:r>
-        <w:lastRenderedPageBreak/>
         <w:t xml:space="preserve">Cutter, S. L., Boruff, B. J., and Shirley, W. L. (2003). "Social Vulnerability to Environmental Hazards*." </w:t>
       </w:r>
       <w:r>
@@ -13838,6 +13852,7 @@
         <w:ind w:left="720" w:hanging="720"/>
       </w:pPr>
       <w:r>
+        <w:lastRenderedPageBreak/>
         <w:t xml:space="preserve">Kasprzyk, J. R., Nataraj, S., Reed, P. M., and Lempert, R. J. (2013). "Many objective robust decision making for complex environmental systems undergoing change." </w:t>
       </w:r>
       <w:r>
@@ -14008,7 +14023,6 @@
         <w:ind w:left="720" w:hanging="720"/>
       </w:pPr>
       <w:r>
-        <w:lastRenderedPageBreak/>
         <w:t xml:space="preserve">Porse, E. C., Sandoval-Solis, S., and Lane, B. A. (2015). "Integrating Environmental Flows into Multi-Objective Reservoir Management for a Transboundary, Water-Scarce River Basin: Rio Grande/Bravo." </w:t>
       </w:r>
       <w:r>
@@ -14219,6 +14233,7 @@
         <w:ind w:left="720" w:hanging="720"/>
       </w:pPr>
       <w:r>
+        <w:lastRenderedPageBreak/>
         <w:t xml:space="preserve">USBR. (2007). "Record of Decision: Colorado River Interim Guidelines for Lower Basin Shortages and Coordinated Operations for Lakes Powell and Mead." U.S. Bureau of Reclamation. </w:t>
       </w:r>
       <w:hyperlink r:id="rId45" w:history="1">
@@ -14420,7 +14435,6 @@
           <w:sz w:val="24"/>
           <w:szCs w:val="24"/>
         </w:rPr>
-        <w:lastRenderedPageBreak/>
         <w:fldChar w:fldCharType="end"/>
       </w:r>
     </w:p>

</xml_diff>

<commit_message>
Calculate current balance, total withdraws, and total debits by state
</commit_message>
<xml_diff>
--- a/LakeMeadWaterConservationProgramAnalysis/LakeMeadWaterConservationProgramSuccessChallengesSuggestions_v2.docx
+++ b/LakeMeadWaterConservationProgramAnalysis/LakeMeadWaterConservationProgramSuccessChallengesSuggestions_v2.docx
@@ -709,22 +709,16 @@
         <w:t xml:space="preserve">This assumption is challenged as the Colorado River Basin becomes more arid. </w:t>
       </w:r>
       <w:r>
-        <w:t>Here, we, seek to improve and adapt it, and underlying river operations, to 21</w:t>
-      </w:r>
-      <w:r>
-        <w:rPr>
-          <w:vertAlign w:val="superscript"/>
-        </w:rPr>
-        <w:t>st</w:t>
-      </w:r>
-      <w:r>
-        <w:t xml:space="preserve"> Century climate conditions. </w:t>
-      </w:r>
-      <w:r>
-        <w:t xml:space="preserve">The next section </w:t>
-      </w:r>
-      <w:r>
-        <w:t xml:space="preserve">reviews prior scholarship on </w:t>
+        <w:t xml:space="preserve">Here, </w:t>
+      </w:r>
+      <w:r>
+        <w:t>we</w:t>
+      </w:r>
+      <w:r>
+        <w:t xml:space="preserve"> </w:t>
+      </w:r>
+      <w:r>
+        <w:t xml:space="preserve">review prior scholarship on </w:t>
       </w:r>
       <w:r>
         <w:t>managing vulnerability</w:t>
@@ -811,89 +805,10 @@
         <w:t xml:space="preserve"> to </w:t>
       </w:r>
       <w:r>
-        <w:t>stabilize and recover</w:t>
-      </w:r>
-      <w:r>
-        <w:t xml:space="preserve"> Lake Mead </w:t>
-      </w:r>
-      <w:r>
-        <w:t>storage for</w:t>
-      </w:r>
-      <w:r>
-        <w:t xml:space="preserve"> conditions of low reservoir storage and inflow. Th</w:t>
-      </w:r>
-      <w:r>
-        <w:t>e</w:t>
-      </w:r>
-      <w:r>
-        <w:t xml:space="preserve"> suggestion also increases </w:t>
-      </w:r>
-      <w:r>
-        <w:t>water user autonomy</w:t>
-      </w:r>
-      <w:r>
-        <w:t xml:space="preserve"> </w:t>
-      </w:r>
-      <w:r>
-        <w:t xml:space="preserve">to manage </w:t>
-      </w:r>
-      <w:r>
-        <w:t xml:space="preserve">their </w:t>
-      </w:r>
-      <w:r>
-        <w:t>vulnerability</w:t>
-      </w:r>
-      <w:r>
-        <w:t xml:space="preserve"> </w:t>
-      </w:r>
-      <w:r>
-        <w:t xml:space="preserve">to water shortages </w:t>
-      </w:r>
-      <w:r>
-        <w:t>more independently of other users</w:t>
-      </w:r>
-      <w:r>
-        <w:t xml:space="preserve"> </w:t>
-      </w:r>
-      <w:r>
-        <w:t>while</w:t>
-      </w:r>
-      <w:r>
-        <w:t xml:space="preserve"> </w:t>
-      </w:r>
-      <w:r>
-        <w:t xml:space="preserve">leverage prior negotiations and </w:t>
-      </w:r>
-      <w:r>
-        <w:t xml:space="preserve">decrease conflicts </w:t>
-      </w:r>
-      <w:r>
-        <w:t xml:space="preserve">post 2026. </w:t>
-      </w:r>
-      <w:r>
-        <w:t>We suggest</w:t>
-      </w:r>
-      <w:r>
-        <w:t xml:space="preserve"> </w:t>
-      </w:r>
-      <w:r>
-        <w:t>switching</w:t>
-      </w:r>
-      <w:r>
-        <w:t xml:space="preserve"> to </w:t>
-      </w:r>
-      <w:r>
-        <w:lastRenderedPageBreak/>
-        <w:t>water accounting</w:t>
-      </w:r>
-      <w:r>
-        <w:t xml:space="preserve"> based on the principles of division of reservoir inflow, subtract evaporation, and users consume and conserve within their available water</w:t>
-      </w:r>
-      <w:r>
-        <w:t xml:space="preserve">. </w:t>
-      </w:r>
-      <w:r>
-        <w:t>The framework moves the concept of entitlement to water towards one that recognizes environmental limits on resource availability. Such a program would stabilize and potentially recover</w:t>
+        <w:t xml:space="preserve">increase program sustainability. Both suggestions switch the accounting from reductions from historical entitlements to reductions from the annual available water. These changes can </w:t>
+      </w:r>
+      <w:r>
+        <w:t>stabilize and potentially recover</w:t>
       </w:r>
       <w:r>
         <w:t xml:space="preserve"> Lake Mead </w:t>
@@ -925,6 +840,7 @@
         <w:pStyle w:val="Heading1"/>
       </w:pPr>
       <w:r>
+        <w:lastRenderedPageBreak/>
         <w:t>Literature Review</w:t>
       </w:r>
     </w:p>
@@ -2060,7 +1976,47 @@
           <w:sz w:val="24"/>
           <w:szCs w:val="24"/>
         </w:rPr>
-        <w:t>In January 2026, Reclamation shared several ways they propose to improve the program for new operations beginning in 2027:</w:t>
+        <w:t xml:space="preserve">In January 2026, Reclamation shared several ways they propose to improve the program </w:t>
+      </w:r>
+      <w:r>
+        <w:rPr>
+          <w:rFonts w:asciiTheme="majorBidi" w:hAnsiTheme="majorBidi" w:cstheme="majorBidi"/>
+          <w:sz w:val="24"/>
+          <w:szCs w:val="24"/>
+        </w:rPr>
+        <w:t>(now called Storage and Recovery)</w:t>
+      </w:r>
+      <w:r>
+        <w:rPr>
+          <w:rFonts w:asciiTheme="majorBidi" w:hAnsiTheme="majorBidi" w:cstheme="majorBidi"/>
+          <w:sz w:val="24"/>
+          <w:szCs w:val="24"/>
+        </w:rPr>
+        <w:t xml:space="preserve"> beginning in 2027</w:t>
+      </w:r>
+      <w:r>
+        <w:rPr>
+          <w:rFonts w:asciiTheme="majorBidi" w:hAnsiTheme="majorBidi" w:cstheme="majorBidi"/>
+          <w:sz w:val="24"/>
+          <w:szCs w:val="24"/>
+        </w:rPr>
+        <w:t>. There is scarce scholarship on the program, including description</w:t>
+      </w:r>
+      <w:r>
+        <w:rPr>
+          <w:rFonts w:asciiTheme="majorBidi" w:hAnsiTheme="majorBidi" w:cstheme="majorBidi"/>
+          <w:sz w:val="24"/>
+          <w:szCs w:val="24"/>
+        </w:rPr>
+        <w:t>s</w:t>
+      </w:r>
+      <w:r>
+        <w:rPr>
+          <w:rFonts w:asciiTheme="majorBidi" w:hAnsiTheme="majorBidi" w:cstheme="majorBidi"/>
+          <w:sz w:val="24"/>
+          <w:szCs w:val="24"/>
+        </w:rPr>
+        <w:t>, successes, challenges, and suggestions to improve sustainability and user autonomy.</w:t>
       </w:r>
     </w:p>
     <w:p>
@@ -6071,7 +6027,7 @@
           <w:sz w:val="24"/>
           <w:szCs w:val="24"/>
         </w:rPr>
-        <w:t>The conservation program kept Lake Mead level above elevation 1</w:t>
+        <w:t xml:space="preserve">The conservation program </w:t>
       </w:r>
       <w:r>
         <w:rPr>
@@ -6081,7 +6037,7 @@
           <w:sz w:val="24"/>
           <w:szCs w:val="24"/>
         </w:rPr>
-        <w:t>,</w:t>
+        <w:t xml:space="preserve">had </w:t>
       </w:r>
       <w:r>
         <w:rPr>
@@ -6091,7 +6047,7 @@
           <w:sz w:val="24"/>
           <w:szCs w:val="24"/>
         </w:rPr>
-        <w:t>020 feet (5.9 million acre-feet) during low lake levels in 2022.</w:t>
+        <w:t>kept Lake Mead level above elevation 1</w:t>
       </w:r>
       <w:r>
         <w:rPr>
@@ -6101,7 +6057,37 @@
           <w:sz w:val="24"/>
           <w:szCs w:val="24"/>
         </w:rPr>
-        <w:t xml:space="preserve"> (Source: XXX)</w:t>
+        <w:t>,</w:t>
+      </w:r>
+      <w:r>
+        <w:rPr>
+          <w:rFonts w:asciiTheme="majorBidi" w:hAnsiTheme="majorBidi" w:cstheme="majorBidi"/>
+          <w:b/>
+          <w:bCs/>
+          <w:sz w:val="24"/>
+          <w:szCs w:val="24"/>
+        </w:rPr>
+        <w:t xml:space="preserve">020 feet (5.9 million acre-feet) </w:t>
+      </w:r>
+      <w:r>
+        <w:rPr>
+          <w:rFonts w:asciiTheme="majorBidi" w:hAnsiTheme="majorBidi" w:cstheme="majorBidi"/>
+          <w:b/>
+          <w:bCs/>
+          <w:sz w:val="24"/>
+          <w:szCs w:val="24"/>
+        </w:rPr>
+        <w:t xml:space="preserve">since </w:t>
+      </w:r>
+      <w:r>
+        <w:rPr>
+          <w:rFonts w:asciiTheme="majorBidi" w:hAnsiTheme="majorBidi" w:cstheme="majorBidi"/>
+          <w:b/>
+          <w:bCs/>
+          <w:sz w:val="24"/>
+          <w:szCs w:val="24"/>
+        </w:rPr>
+        <w:t>2022.</w:t>
       </w:r>
     </w:p>
     <w:p>
@@ -6480,7 +6466,23 @@
           <w:sz w:val="24"/>
           <w:szCs w:val="24"/>
         </w:rPr>
-        <w:t>states and contractors face increasing difficulty to access and debit their water conservation account balances.</w:t>
+        <w:t xml:space="preserve">states and contractors face increasing difficulty to access and debit their </w:t>
+      </w:r>
+      <w:r>
+        <w:rPr>
+          <w:rFonts w:asciiTheme="majorBidi" w:hAnsiTheme="majorBidi" w:cstheme="majorBidi"/>
+          <w:sz w:val="24"/>
+          <w:szCs w:val="24"/>
+        </w:rPr>
+        <w:t>conserved water</w:t>
+      </w:r>
+      <w:r>
+        <w:rPr>
+          <w:rFonts w:asciiTheme="majorBidi" w:hAnsiTheme="majorBidi" w:cstheme="majorBidi"/>
+          <w:sz w:val="24"/>
+          <w:szCs w:val="24"/>
+        </w:rPr>
+        <w:t>.</w:t>
       </w:r>
       <w:r>
         <w:rPr>
@@ -6805,11 +6807,7 @@
           </mc:Choice>
           <mc:Fallback>
             <w:pict>
-              <v:shapetype w14:anchorId="0BFD2EC6" id="_x0000_t202" coordsize="21600,21600" o:spt="202" path="m,l,21600r21600,l21600,xe">
-                <v:stroke joinstyle="miter"/>
-                <v:path gradientshapeok="t" o:connecttype="rect"/>
-              </v:shapetype>
-              <v:shape id="_x0000_s1027" type="#_x0000_t202" style="position:absolute;left:0;text-align:left;margin-left:206.35pt;margin-top:1.65pt;width:267.75pt;height:235.55pt;z-index:251671552;visibility:visible;mso-wrap-style:square;mso-width-percent:0;mso-height-percent:0;mso-wrap-distance-left:9pt;mso-wrap-distance-top:3.6pt;mso-wrap-distance-right:9pt;mso-wrap-distance-bottom:3.6pt;mso-position-horizontal:absolute;mso-position-horizontal-relative:text;mso-position-vertical:absolute;mso-position-vertical-relative:text;mso-width-percent:0;mso-height-percent:0;mso-width-relative:margin;mso-height-relative:margin;v-text-anchor:top" o:gfxdata="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">
+              <v:shape w14:anchorId="0BFD2EC6" id="_x0000_s1027" type="#_x0000_t202" style="position:absolute;left:0;text-align:left;margin-left:206.35pt;margin-top:1.65pt;width:267.75pt;height:235.55pt;z-index:251671552;visibility:visible;mso-wrap-style:square;mso-width-percent:0;mso-height-percent:0;mso-wrap-distance-left:9pt;mso-wrap-distance-top:3.6pt;mso-wrap-distance-right:9pt;mso-wrap-distance-bottom:3.6pt;mso-position-horizontal:absolute;mso-position-horizontal-relative:text;mso-position-vertical:absolute;mso-position-vertical-relative:text;mso-width-percent:0;mso-height-percent:0;mso-width-relative:margin;mso-height-relative:margin;v-text-anchor:top" o:gfxdata="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">
                 <v:textbox>
                   <w:txbxContent>
                     <w:p>
@@ -11364,421 +11362,32 @@
         </w:rPr>
         <w:t xml:space="preserve">. </w:t>
       </w:r>
-      <w:r>
-        <w:rPr>
-          <w:rFonts w:asciiTheme="majorBidi" w:hAnsiTheme="majorBidi" w:cstheme="majorBidi"/>
-          <w:sz w:val="24"/>
-          <w:szCs w:val="24"/>
-        </w:rPr>
-        <w:t>During a</w:t>
-      </w:r>
-      <w:r>
-        <w:rPr>
-          <w:rFonts w:asciiTheme="majorBidi" w:hAnsiTheme="majorBidi" w:cstheme="majorBidi"/>
-          <w:sz w:val="24"/>
-          <w:szCs w:val="24"/>
-        </w:rPr>
-        <w:t xml:space="preserve"> model</w:t>
-      </w:r>
-      <w:r>
-        <w:rPr>
-          <w:rFonts w:asciiTheme="majorBidi" w:hAnsiTheme="majorBidi" w:cstheme="majorBidi"/>
-          <w:sz w:val="24"/>
-          <w:szCs w:val="24"/>
-        </w:rPr>
-        <w:t xml:space="preserve"> session</w:t>
-      </w:r>
-      <w:r>
-        <w:rPr>
-          <w:rFonts w:asciiTheme="majorBidi" w:hAnsiTheme="majorBidi" w:cstheme="majorBidi"/>
-          <w:sz w:val="24"/>
-          <w:szCs w:val="24"/>
-        </w:rPr>
-        <w:t>, collaborators</w:t>
-      </w:r>
-      <w:r>
-        <w:rPr>
-          <w:rFonts w:asciiTheme="majorBidi" w:hAnsiTheme="majorBidi" w:cstheme="majorBidi"/>
-          <w:sz w:val="24"/>
-          <w:szCs w:val="24"/>
-        </w:rPr>
-        <w:t xml:space="preserve"> make extreme assumptions for hydrology, </w:t>
-      </w:r>
-      <w:r>
-        <w:rPr>
-          <w:rFonts w:asciiTheme="majorBidi" w:hAnsiTheme="majorBidi" w:cstheme="majorBidi"/>
-          <w:sz w:val="24"/>
-          <w:szCs w:val="24"/>
-        </w:rPr>
-        <w:t>ecosystem responses</w:t>
-      </w:r>
-      <w:r>
-        <w:rPr>
-          <w:rFonts w:asciiTheme="majorBidi" w:hAnsiTheme="majorBidi" w:cstheme="majorBidi"/>
-          <w:sz w:val="24"/>
-          <w:szCs w:val="24"/>
-        </w:rPr>
-        <w:t>, and starting reservoir storage. Collaborators then</w:t>
-      </w:r>
-      <w:r>
-        <w:rPr>
-          <w:rFonts w:asciiTheme="majorBidi" w:hAnsiTheme="majorBidi" w:cstheme="majorBidi"/>
-          <w:sz w:val="24"/>
-          <w:szCs w:val="24"/>
-        </w:rPr>
-        <w:t xml:space="preserve"> immerse in water user roles. They decide how much water to release and conserve in response to their available water, other’s choices, and real-time discussion of choices. As researchers, we </w:t>
-      </w:r>
-      <w:r>
-        <w:rPr>
-          <w:rFonts w:asciiTheme="majorBidi" w:hAnsiTheme="majorBidi" w:cstheme="majorBidi"/>
-          <w:sz w:val="24"/>
-          <w:szCs w:val="24"/>
-        </w:rPr>
-        <w:t>want</w:t>
-      </w:r>
-      <w:r>
-        <w:rPr>
-          <w:rFonts w:asciiTheme="majorBidi" w:hAnsiTheme="majorBidi" w:cstheme="majorBidi"/>
-          <w:sz w:val="24"/>
-          <w:szCs w:val="24"/>
-        </w:rPr>
-        <w:t xml:space="preserve"> to learn</w:t>
-      </w:r>
-      <w:r>
-        <w:rPr>
-          <w:rFonts w:asciiTheme="majorBidi" w:hAnsiTheme="majorBidi" w:cstheme="majorBidi"/>
-          <w:sz w:val="24"/>
-          <w:szCs w:val="24"/>
-        </w:rPr>
-        <w:t>:</w:t>
-      </w:r>
     </w:p>
     <w:p>
       <w:pPr>
-        <w:pStyle w:val="ListParagraph"/>
-        <w:numPr>
-          <w:ilvl w:val="0"/>
-          <w:numId w:val="25"/>
-        </w:numPr>
-        <w:rPr>
-          <w:rFonts w:asciiTheme="majorBidi" w:hAnsiTheme="majorBidi" w:cstheme="majorBidi"/>
-          <w:sz w:val="24"/>
-          <w:szCs w:val="24"/>
-        </w:rPr>
-      </w:pPr>
-      <w:r>
-        <w:rPr>
-          <w:rFonts w:asciiTheme="majorBidi" w:hAnsiTheme="majorBidi" w:cstheme="majorBidi"/>
-          <w:i/>
-          <w:iCs/>
-          <w:sz w:val="24"/>
-          <w:szCs w:val="24"/>
-        </w:rPr>
-        <w:lastRenderedPageBreak/>
-        <w:t xml:space="preserve">Why </w:t>
-      </w:r>
-      <w:r>
-        <w:rPr>
-          <w:rFonts w:asciiTheme="majorBidi" w:hAnsiTheme="majorBidi" w:cstheme="majorBidi"/>
-          <w:sz w:val="24"/>
-          <w:szCs w:val="24"/>
-        </w:rPr>
-        <w:t xml:space="preserve">basin partners choose assumptions and </w:t>
-      </w:r>
-      <w:r>
-        <w:rPr>
-          <w:rFonts w:asciiTheme="majorBidi" w:hAnsiTheme="majorBidi" w:cstheme="majorBidi"/>
-          <w:i/>
-          <w:iCs/>
-          <w:sz w:val="24"/>
-          <w:szCs w:val="24"/>
-        </w:rPr>
-        <w:t xml:space="preserve">how </w:t>
-      </w:r>
-      <w:r>
-        <w:rPr>
-          <w:rFonts w:asciiTheme="majorBidi" w:hAnsiTheme="majorBidi" w:cstheme="majorBidi"/>
-          <w:sz w:val="24"/>
-          <w:szCs w:val="24"/>
-        </w:rPr>
-        <w:t>extreme.</w:t>
+        <w:pStyle w:val="Heading1"/>
+      </w:pPr>
+      <w:r>
+        <w:t>Data Availability</w:t>
       </w:r>
     </w:p>
     <w:p>
       <w:pPr>
-        <w:pStyle w:val="ListParagraph"/>
-        <w:numPr>
-          <w:ilvl w:val="0"/>
-          <w:numId w:val="25"/>
-        </w:numPr>
-        <w:rPr>
-          <w:rFonts w:asciiTheme="majorBidi" w:hAnsiTheme="majorBidi" w:cstheme="majorBidi"/>
-          <w:sz w:val="24"/>
-          <w:szCs w:val="24"/>
-        </w:rPr>
-      </w:pPr>
-      <w:r>
-        <w:rPr>
-          <w:rFonts w:asciiTheme="majorBidi" w:hAnsiTheme="majorBidi" w:cstheme="majorBidi"/>
-          <w:i/>
-          <w:iCs/>
-          <w:sz w:val="24"/>
-          <w:szCs w:val="24"/>
-        </w:rPr>
-        <w:t>W</w:t>
-      </w:r>
-      <w:r>
-        <w:rPr>
-          <w:rFonts w:asciiTheme="majorBidi" w:hAnsiTheme="majorBidi" w:cstheme="majorBidi"/>
-          <w:i/>
-          <w:iCs/>
-          <w:sz w:val="24"/>
-          <w:szCs w:val="24"/>
-        </w:rPr>
-        <w:t xml:space="preserve">hy </w:t>
-      </w:r>
-      <w:r>
-        <w:rPr>
-          <w:rFonts w:asciiTheme="majorBidi" w:hAnsiTheme="majorBidi" w:cstheme="majorBidi"/>
-          <w:sz w:val="24"/>
-          <w:szCs w:val="24"/>
-        </w:rPr>
-        <w:t xml:space="preserve">and </w:t>
-      </w:r>
-      <w:r>
-        <w:rPr>
-          <w:rFonts w:asciiTheme="majorBidi" w:hAnsiTheme="majorBidi" w:cstheme="majorBidi"/>
-          <w:i/>
-          <w:iCs/>
-          <w:sz w:val="24"/>
-          <w:szCs w:val="24"/>
-        </w:rPr>
-        <w:t>how</w:t>
-      </w:r>
-      <w:r>
-        <w:rPr>
-          <w:rFonts w:asciiTheme="majorBidi" w:hAnsiTheme="majorBidi" w:cstheme="majorBidi"/>
-          <w:sz w:val="24"/>
-          <w:szCs w:val="24"/>
-        </w:rPr>
-        <w:t xml:space="preserve"> </w:t>
-      </w:r>
-      <w:r>
-        <w:rPr>
-          <w:rFonts w:asciiTheme="majorBidi" w:hAnsiTheme="majorBidi" w:cstheme="majorBidi"/>
-          <w:sz w:val="24"/>
-          <w:szCs w:val="24"/>
-        </w:rPr>
-        <w:t xml:space="preserve">basin </w:t>
-      </w:r>
-      <w:r>
-        <w:rPr>
-          <w:rFonts w:asciiTheme="majorBidi" w:hAnsiTheme="majorBidi" w:cstheme="majorBidi"/>
-          <w:sz w:val="24"/>
-          <w:szCs w:val="24"/>
-        </w:rPr>
-        <w:t xml:space="preserve">partners </w:t>
-      </w:r>
-      <w:r>
-        <w:rPr>
-          <w:rFonts w:asciiTheme="majorBidi" w:hAnsiTheme="majorBidi" w:cstheme="majorBidi"/>
-          <w:sz w:val="24"/>
-          <w:szCs w:val="24"/>
-        </w:rPr>
-        <w:t>manage their risk of uncertain future water supply</w:t>
-      </w:r>
-      <w:r>
-        <w:rPr>
-          <w:rFonts w:asciiTheme="majorBidi" w:hAnsiTheme="majorBidi" w:cstheme="majorBidi"/>
-          <w:sz w:val="24"/>
-          <w:szCs w:val="24"/>
-        </w:rPr>
-        <w:t>.</w:t>
-      </w:r>
-    </w:p>
-    <w:p>
-      <w:pPr>
-        <w:pStyle w:val="ListParagraph"/>
-        <w:numPr>
-          <w:ilvl w:val="0"/>
-          <w:numId w:val="25"/>
-        </w:numPr>
-        <w:rPr>
-          <w:rFonts w:asciiTheme="majorBidi" w:hAnsiTheme="majorBidi" w:cstheme="majorBidi"/>
-          <w:sz w:val="24"/>
-          <w:szCs w:val="24"/>
-        </w:rPr>
-      </w:pPr>
-      <w:r>
-        <w:rPr>
-          <w:rFonts w:asciiTheme="majorBidi" w:hAnsiTheme="majorBidi" w:cstheme="majorBidi"/>
-          <w:i/>
-          <w:iCs/>
-          <w:sz w:val="24"/>
-          <w:szCs w:val="24"/>
-        </w:rPr>
-        <w:t>W</w:t>
-      </w:r>
-      <w:r>
-        <w:rPr>
-          <w:rFonts w:asciiTheme="majorBidi" w:hAnsiTheme="majorBidi" w:cstheme="majorBidi"/>
-          <w:i/>
-          <w:iCs/>
-          <w:sz w:val="24"/>
-          <w:szCs w:val="24"/>
-        </w:rPr>
-        <w:t xml:space="preserve">hich </w:t>
-      </w:r>
-      <w:r>
-        <w:rPr>
-          <w:rFonts w:asciiTheme="majorBidi" w:hAnsiTheme="majorBidi" w:cstheme="majorBidi"/>
-          <w:sz w:val="24"/>
-          <w:szCs w:val="24"/>
-        </w:rPr>
-        <w:t>new insights they take from a model session</w:t>
-      </w:r>
-      <w:r>
-        <w:rPr>
-          <w:rFonts w:asciiTheme="majorBidi" w:hAnsiTheme="majorBidi" w:cstheme="majorBidi"/>
-          <w:sz w:val="24"/>
-          <w:szCs w:val="24"/>
-        </w:rPr>
-        <w:t>.</w:t>
-      </w:r>
-    </w:p>
-    <w:p>
-      <w:pPr>
-        <w:rPr>
-          <w:rFonts w:asciiTheme="majorBidi" w:hAnsiTheme="majorBidi" w:cstheme="majorBidi"/>
-          <w:sz w:val="24"/>
-          <w:szCs w:val="24"/>
-        </w:rPr>
-      </w:pPr>
-      <w:r>
-        <w:rPr>
-          <w:rFonts w:asciiTheme="majorBidi" w:hAnsiTheme="majorBidi" w:cstheme="majorBidi"/>
-          <w:sz w:val="24"/>
-          <w:szCs w:val="24"/>
-        </w:rPr>
-        <w:t xml:space="preserve">We believe </w:t>
-      </w:r>
-      <w:r>
-        <w:rPr>
-          <w:rFonts w:asciiTheme="majorBidi" w:hAnsiTheme="majorBidi" w:cstheme="majorBidi"/>
-          <w:sz w:val="24"/>
-          <w:szCs w:val="24"/>
-        </w:rPr>
-        <w:t>these discussions</w:t>
-      </w:r>
-      <w:r>
-        <w:rPr>
-          <w:rFonts w:asciiTheme="majorBidi" w:hAnsiTheme="majorBidi" w:cstheme="majorBidi"/>
-          <w:sz w:val="24"/>
-          <w:szCs w:val="24"/>
-        </w:rPr>
-        <w:t xml:space="preserve"> can help inform </w:t>
-      </w:r>
-      <w:r>
-        <w:rPr>
-          <w:rFonts w:asciiTheme="majorBidi" w:hAnsiTheme="majorBidi" w:cstheme="majorBidi"/>
-          <w:sz w:val="24"/>
-          <w:szCs w:val="24"/>
-        </w:rPr>
-        <w:t xml:space="preserve">how to </w:t>
-      </w:r>
-      <w:r>
-        <w:rPr>
-          <w:rFonts w:asciiTheme="majorBidi" w:hAnsiTheme="majorBidi" w:cstheme="majorBidi"/>
-          <w:sz w:val="24"/>
-          <w:szCs w:val="24"/>
-        </w:rPr>
-        <w:t xml:space="preserve">simulate impacts of Lake Mead water accounting and </w:t>
-      </w:r>
-      <w:r>
-        <w:rPr>
-          <w:rFonts w:asciiTheme="majorBidi" w:hAnsiTheme="majorBidi" w:cstheme="majorBidi"/>
-          <w:sz w:val="24"/>
-          <w:szCs w:val="24"/>
-        </w:rPr>
-        <w:t xml:space="preserve">reduce conflicting system, user, Tribal, and ecosystem </w:t>
-      </w:r>
-      <w:r>
-        <w:rPr>
-          <w:rFonts w:asciiTheme="majorBidi" w:hAnsiTheme="majorBidi" w:cstheme="majorBidi"/>
-          <w:sz w:val="24"/>
-          <w:szCs w:val="24"/>
-        </w:rPr>
-        <w:t>vulnerabilities</w:t>
-      </w:r>
-      <w:r>
-        <w:rPr>
-          <w:rFonts w:asciiTheme="majorBidi" w:hAnsiTheme="majorBidi" w:cstheme="majorBidi"/>
-          <w:sz w:val="24"/>
-          <w:szCs w:val="24"/>
-        </w:rPr>
-        <w:t xml:space="preserve"> to water shortages.</w:t>
-      </w:r>
-      <w:r>
-        <w:rPr>
-          <w:rFonts w:asciiTheme="majorBidi" w:hAnsiTheme="majorBidi" w:cstheme="majorBidi"/>
-          <w:sz w:val="24"/>
-          <w:szCs w:val="24"/>
-        </w:rPr>
-        <w:t xml:space="preserve"> </w:t>
-      </w:r>
-      <w:r>
-        <w:rPr>
-          <w:rFonts w:asciiTheme="majorBidi" w:hAnsiTheme="majorBidi" w:cstheme="majorBidi"/>
-          <w:sz w:val="24"/>
-          <w:szCs w:val="24"/>
-        </w:rPr>
-        <w:t xml:space="preserve">Reach out by email to </w:t>
+        <w:rPr>
+          <w:rFonts w:asciiTheme="majorBidi" w:hAnsiTheme="majorBidi" w:cstheme="majorBidi"/>
+          <w:sz w:val="24"/>
+          <w:szCs w:val="24"/>
+        </w:rPr>
+      </w:pPr>
+      <w:r>
+        <w:rPr>
+          <w:rFonts w:asciiTheme="majorBidi" w:hAnsiTheme="majorBidi" w:cstheme="majorBidi"/>
+          <w:sz w:val="24"/>
+          <w:szCs w:val="24"/>
+        </w:rPr>
+        <w:t xml:space="preserve">The data, models, and code used to generate tables and figures in this manuscript are available for download at </w:t>
       </w:r>
       <w:hyperlink r:id="rId16" w:history="1">
-        <w:r>
-          <w:rPr>
-            <w:rStyle w:val="Hyperlink"/>
-            <w:rFonts w:asciiTheme="majorBidi" w:hAnsiTheme="majorBidi" w:cstheme="majorBidi"/>
-            <w:sz w:val="24"/>
-            <w:szCs w:val="24"/>
-          </w:rPr>
-          <w:t>david.rosenberg@usu.edu</w:t>
-        </w:r>
-      </w:hyperlink>
-      <w:r>
-        <w:rPr>
-          <w:rFonts w:asciiTheme="majorBidi" w:hAnsiTheme="majorBidi" w:cstheme="majorBidi"/>
-          <w:sz w:val="24"/>
-          <w:szCs w:val="24"/>
-        </w:rPr>
-        <w:t xml:space="preserve"> if you have read this far and want to join a collaborative model session.</w:t>
-      </w:r>
-    </w:p>
-    <w:p>
-      <w:pPr>
-        <w:pStyle w:val="Heading1"/>
-      </w:pPr>
-      <w:r>
-        <w:t>Data Availability</w:t>
-      </w:r>
-    </w:p>
-    <w:p>
-      <w:pPr>
-        <w:rPr>
-          <w:rFonts w:asciiTheme="majorBidi" w:hAnsiTheme="majorBidi" w:cstheme="majorBidi"/>
-          <w:sz w:val="24"/>
-          <w:szCs w:val="24"/>
-        </w:rPr>
-      </w:pPr>
-      <w:r>
-        <w:rPr>
-          <w:rFonts w:asciiTheme="majorBidi" w:hAnsiTheme="majorBidi" w:cstheme="majorBidi"/>
-          <w:sz w:val="24"/>
-          <w:szCs w:val="24"/>
-        </w:rPr>
-        <w:t xml:space="preserve">The data, models, and code used to generate tables and figures in this manuscript are available for download at </w:t>
-      </w:r>
-      <w:hyperlink r:id="rId17" w:history="1">
         <w:r>
           <w:rPr>
             <w:rStyle w:val="Hyperlink"/>
@@ -11942,7 +11551,15 @@
           <w:sz w:val="24"/>
           <w:szCs w:val="24"/>
         </w:rPr>
-        <w:t>historical allocation minus the</w:t>
+        <w:t>legal entitlement</w:t>
+      </w:r>
+      <w:r>
+        <w:rPr>
+          <w:rFonts w:asciiTheme="majorBidi" w:hAnsiTheme="majorBidi" w:cstheme="majorBidi"/>
+          <w:sz w:val="24"/>
+          <w:szCs w:val="24"/>
+        </w:rPr>
+        <w:t xml:space="preserve"> minus the</w:t>
       </w:r>
       <w:r>
         <w:rPr>
@@ -12178,7 +11795,7 @@
                     </pic:cNvPicPr>
                   </pic:nvPicPr>
                   <pic:blipFill>
-                    <a:blip r:embed="rId18">
+                    <a:blip r:embed="rId17">
                       <a:extLst>
                         <a:ext uri="{28A0092B-C50C-407E-A947-70E740481C1C}">
                           <a14:useLocalDpi xmlns:a14="http://schemas.microsoft.com/office/drawing/2010/main" val="0"/>
@@ -12296,7 +11913,6 @@
         <w:rPr>
           <w:noProof/>
         </w:rPr>
-        <w:lastRenderedPageBreak/>
         <w:drawing>
           <wp:inline distT="0" distB="0" distL="0" distR="0" wp14:anchorId="3DFF5439" wp14:editId="46D10C37">
             <wp:extent cx="5943600" cy="1592580"/>
@@ -12315,7 +11931,7 @@
                     </pic:cNvPicPr>
                   </pic:nvPicPr>
                   <pic:blipFill>
-                    <a:blip r:embed="rId19">
+                    <a:blip r:embed="rId18">
                       <a:extLst>
                         <a:ext uri="{28A0092B-C50C-407E-A947-70E740481C1C}">
                           <a14:useLocalDpi xmlns:a14="http://schemas.microsoft.com/office/drawing/2010/main" val="0"/>
@@ -12631,6 +12247,7 @@
           <w:sz w:val="24"/>
           <w:szCs w:val="24"/>
         </w:rPr>
+        <w:lastRenderedPageBreak/>
         <w:t xml:space="preserve">Arizona [C] = 2.8 ─ </w:t>
       </w:r>
       <w:r>
@@ -13339,7 +12956,6 @@
           <w:sz w:val="24"/>
           <w:szCs w:val="24"/>
         </w:rPr>
-        <w:lastRenderedPageBreak/>
         <w:t xml:space="preserve">Nevada and Mexico’s percent shares of the </w:t>
       </w:r>
       <w:r>
@@ -13503,7 +13119,7 @@
       <w:r>
         <w:t xml:space="preserve">, 4(2), e1274. </w:t>
       </w:r>
-      <w:hyperlink r:id="rId20" w:history="1">
+      <w:hyperlink r:id="rId19" w:history="1">
         <w:r>
           <w:rPr>
             <w:rStyle w:val="Hyperlink"/>
@@ -13533,7 +13149,7 @@
       <w:r>
         <w:t xml:space="preserve">, November 8, 2021. </w:t>
       </w:r>
-      <w:hyperlink r:id="rId21" w:history="1">
+      <w:hyperlink r:id="rId20" w:history="1">
         <w:r>
           <w:rPr>
             <w:rStyle w:val="Hyperlink"/>
@@ -13554,7 +13170,7 @@
       <w:r>
         <w:t xml:space="preserve">Buschatzke, T., Hamby, J. B., and Entsminger, J. (2024). "Lower Basin Alternative for the Post-2026 Coordinated Operation of the Colorado River Basin." </w:t>
       </w:r>
-      <w:hyperlink r:id="rId22" w:history="1">
+      <w:hyperlink r:id="rId21" w:history="1">
         <w:r>
           <w:rPr>
             <w:rStyle w:val="Hyperlink"/>
@@ -13573,9 +13189,10 @@
         <w:ind w:left="720" w:hanging="720"/>
       </w:pPr>
       <w:r>
+        <w:lastRenderedPageBreak/>
         <w:t xml:space="preserve">CAP. (2022). "ICS – Three little letters that signify big contributions and new flexibility." Central Arizona Project, </w:t>
       </w:r>
-      <w:hyperlink r:id="rId23" w:history="1">
+      <w:hyperlink r:id="rId22" w:history="1">
         <w:r>
           <w:rPr>
             <w:rStyle w:val="Hyperlink"/>
@@ -13596,7 +13213,7 @@
       <w:r>
         <w:t xml:space="preserve">City of Phoenix. (2024). "Additional concepts for consideration - City of Phoenix." </w:t>
       </w:r>
-      <w:hyperlink r:id="rId24" w:history="1">
+      <w:hyperlink r:id="rId23" w:history="1">
         <w:r>
           <w:rPr>
             <w:rStyle w:val="Hyperlink"/>
@@ -13626,7 +13243,7 @@
       <w:r>
         <w:t xml:space="preserve">, 84(2), 242-261. </w:t>
       </w:r>
-      <w:hyperlink r:id="rId25" w:history="1">
+      <w:hyperlink r:id="rId24" w:history="1">
         <w:r>
           <w:rPr>
             <w:rStyle w:val="Hyperlink"/>
@@ -13656,7 +13273,7 @@
       <w:r>
         <w:t xml:space="preserve">, 90(4), 713-737. </w:t>
       </w:r>
-      <w:hyperlink r:id="rId26" w:history="1">
+      <w:hyperlink r:id="rId25" w:history="1">
         <w:r>
           <w:rPr>
             <w:rStyle w:val="Hyperlink"/>
@@ -13692,7 +13309,7 @@
         <w:spacing w:after="0"/>
         <w:ind w:left="720" w:hanging="720"/>
       </w:pPr>
-      <w:hyperlink r:id="rId27" w:history="1">
+      <w:hyperlink r:id="rId26" w:history="1">
         <w:r>
           <w:rPr>
             <w:rStyle w:val="Hyperlink"/>
@@ -13722,7 +13339,7 @@
       <w:r>
         <w:t xml:space="preserve">, 375(3-4), 627-643. </w:t>
       </w:r>
-      <w:hyperlink r:id="rId28" w:history="1">
+      <w:hyperlink r:id="rId27" w:history="1">
         <w:r>
           <w:rPr>
             <w:rStyle w:val="Hyperlink"/>
@@ -13752,7 +13369,7 @@
       <w:r>
         <w:t xml:space="preserve">, 146(5), 04020017. </w:t>
       </w:r>
-      <w:hyperlink r:id="rId29" w:history="1">
+      <w:hyperlink r:id="rId28" w:history="1">
         <w:r>
           <w:rPr>
             <w:rStyle w:val="Hyperlink"/>
@@ -13782,7 +13399,7 @@
       <w:r>
         <w:t xml:space="preserve">. </w:t>
       </w:r>
-      <w:hyperlink r:id="rId30" w:history="1">
+      <w:hyperlink r:id="rId29" w:history="1">
         <w:r>
           <w:rPr>
             <w:rStyle w:val="Hyperlink"/>
@@ -13803,7 +13420,7 @@
       <w:r>
         <w:t xml:space="preserve">IBWC. (2021). "Minutes between the United States and Mexican Sections of the IBWC." United States Section, </w:t>
       </w:r>
-      <w:hyperlink r:id="rId31" w:history="1">
+      <w:hyperlink r:id="rId30" w:history="1">
         <w:r>
           <w:rPr>
             <w:rStyle w:val="Hyperlink"/>
@@ -13833,7 +13450,7 @@
       <w:r>
         <w:t xml:space="preserve">, 372(6540), 418-421. </w:t>
       </w:r>
-      <w:hyperlink r:id="rId32" w:history="1">
+      <w:hyperlink r:id="rId31" w:history="1">
         <w:r>
           <w:rPr>
             <w:rStyle w:val="Hyperlink"/>
@@ -13852,7 +13469,6 @@
         <w:ind w:left="720" w:hanging="720"/>
       </w:pPr>
       <w:r>
-        <w:lastRenderedPageBreak/>
         <w:t xml:space="preserve">Kasprzyk, J. R., Nataraj, S., Reed, P. M., and Lempert, R. J. (2013). "Many objective robust decision making for complex environmental systems undergoing change." </w:t>
       </w:r>
       <w:r>
@@ -13864,7 +13480,7 @@
       <w:r>
         <w:t xml:space="preserve">, 42(0), 55-71. </w:t>
       </w:r>
-      <w:hyperlink r:id="rId33" w:history="1">
+      <w:hyperlink r:id="rId32" w:history="1">
         <w:r>
           <w:rPr>
             <w:rStyle w:val="Hyperlink"/>
@@ -13913,7 +13529,7 @@
       <w:r>
         <w:t xml:space="preserve">, 7(6), e1486. </w:t>
       </w:r>
-      <w:hyperlink r:id="rId34" w:history="1">
+      <w:hyperlink r:id="rId33" w:history="1">
         <w:r>
           <w:rPr>
             <w:rStyle w:val="Hyperlink"/>
@@ -13953,7 +13569,7 @@
       <w:r>
         <w:t xml:space="preserve">Mitchell, R., Shawcroft, G., Lopez, E., and Gebhart, B. (2024). "Upper Division States Alternative." </w:t>
       </w:r>
-      <w:hyperlink r:id="rId35" w:history="1">
+      <w:hyperlink r:id="rId34" w:history="1">
         <w:r>
           <w:rPr>
             <w:rStyle w:val="Hyperlink"/>
@@ -13983,7 +13599,7 @@
       <w:r>
         <w:t xml:space="preserve">, 19(3), 1419. </w:t>
       </w:r>
-      <w:hyperlink r:id="rId36" w:history="1">
+      <w:hyperlink r:id="rId35" w:history="1">
         <w:r>
           <w:rPr>
             <w:rStyle w:val="Hyperlink"/>
@@ -14002,9 +13618,10 @@
         <w:ind w:left="720" w:hanging="720"/>
       </w:pPr>
       <w:r>
+        <w:lastRenderedPageBreak/>
         <w:t xml:space="preserve">Pitt, J., Miller, B., Funk, A., Rice, M., Hawes, T., Moran, K., and Porterfield, S. (2024 ). "Conservation Groups’ Cooperative Conservation Alternative for Post-2026 Colorado River Guidelines Operations and Strategies." Reclamation. </w:t>
       </w:r>
-      <w:hyperlink r:id="rId37" w:history="1">
+      <w:hyperlink r:id="rId36" w:history="1">
         <w:r>
           <w:rPr>
             <w:rStyle w:val="Hyperlink"/>
@@ -14034,7 +13651,7 @@
       <w:r>
         <w:t xml:space="preserve">, 29(8), 2471-2484. </w:t>
       </w:r>
-      <w:hyperlink r:id="rId38" w:history="1">
+      <w:hyperlink r:id="rId37" w:history="1">
         <w:r>
           <w:rPr>
             <w:rStyle w:val="Hyperlink"/>
@@ -14064,7 +13681,7 @@
       <w:r>
         <w:t xml:space="preserve">, 148(10), 02522006. </w:t>
       </w:r>
-      <w:hyperlink r:id="rId39" w:history="1">
+      <w:hyperlink r:id="rId38" w:history="1">
         <w:r>
           <w:rPr>
             <w:rStyle w:val="Hyperlink"/>
@@ -14094,7 +13711,7 @@
       <w:r>
         <w:t xml:space="preserve">, 150(7). </w:t>
       </w:r>
-      <w:hyperlink r:id="rId40" w:history="1">
+      <w:hyperlink r:id="rId39" w:history="1">
         <w:r>
           <w:rPr>
             <w:rStyle w:val="Hyperlink"/>
@@ -14124,7 +13741,7 @@
       <w:r>
         <w:t xml:space="preserve">, 22(2), 4-21. </w:t>
       </w:r>
-      <w:hyperlink r:id="rId41" w:history="1">
+      <w:hyperlink r:id="rId40" w:history="1">
         <w:r>
           <w:rPr>
             <w:rStyle w:val="Hyperlink"/>
@@ -14154,7 +13771,7 @@
       <w:r>
         <w:t xml:space="preserve">, 10(2), e565. </w:t>
       </w:r>
-      <w:hyperlink r:id="rId42" w:history="1">
+      <w:hyperlink r:id="rId41" w:history="1">
         <w:r>
           <w:rPr>
             <w:rStyle w:val="Hyperlink"/>
@@ -14184,7 +13801,7 @@
       <w:r>
         <w:t xml:space="preserve">. </w:t>
       </w:r>
-      <w:hyperlink r:id="rId43" w:history="1">
+      <w:hyperlink r:id="rId42" w:history="1">
         <w:r>
           <w:rPr>
             <w:rStyle w:val="Hyperlink"/>
@@ -14214,7 +13831,7 @@
       <w:r>
         <w:t xml:space="preserve">. </w:t>
       </w:r>
-      <w:hyperlink r:id="rId44" w:history="1">
+      <w:hyperlink r:id="rId43" w:history="1">
         <w:r>
           <w:rPr>
             <w:rStyle w:val="Hyperlink"/>
@@ -14233,10 +13850,9 @@
         <w:ind w:left="720" w:hanging="720"/>
       </w:pPr>
       <w:r>
-        <w:lastRenderedPageBreak/>
         <w:t xml:space="preserve">USBR. (2007). "Record of Decision: Colorado River Interim Guidelines for Lower Basin Shortages and Coordinated Operations for Lakes Powell and Mead." U.S. Bureau of Reclamation. </w:t>
       </w:r>
-      <w:hyperlink r:id="rId45" w:history="1">
+      <w:hyperlink r:id="rId44" w:history="1">
         <w:r>
           <w:rPr>
             <w:rStyle w:val="Hyperlink"/>
@@ -14257,7 +13873,7 @@
       <w:r>
         <w:t xml:space="preserve">USBR. (2019). "Agreement Concerning Colorado River Drought Contingency Management and Operations." U.S. Bureau of Reclamation, Washington, DC. </w:t>
       </w:r>
-      <w:hyperlink r:id="rId46" w:history="1">
+      <w:hyperlink r:id="rId45" w:history="1">
         <w:r>
           <w:rPr>
             <w:rStyle w:val="Hyperlink"/>
@@ -14278,7 +13894,7 @@
       <w:r>
         <w:t xml:space="preserve">USBR. (2021a). "Boulder Canyon Operations Office - Program and Activities: Water Accounting Reports." U.S. Bureau of Reclamation. </w:t>
       </w:r>
-      <w:hyperlink r:id="rId47" w:history="1">
+      <w:hyperlink r:id="rId46" w:history="1">
         <w:r>
           <w:rPr>
             <w:rStyle w:val="Hyperlink"/>
@@ -14299,7 +13915,7 @@
       <w:r>
         <w:t xml:space="preserve">USBR. (2021b). "Pilot System Conservation Program." U.S. Bureau of Reclamation, </w:t>
       </w:r>
-      <w:hyperlink r:id="rId48" w:history="1">
+      <w:hyperlink r:id="rId47" w:history="1">
         <w:r>
           <w:rPr>
             <w:rStyle w:val="Hyperlink"/>
@@ -14329,7 +13945,7 @@
       <w:r>
         <w:t xml:space="preserve">, 147(9), 04021034. </w:t>
       </w:r>
-      <w:hyperlink r:id="rId49" w:history="1">
+      <w:hyperlink r:id="rId48" w:history="1">
         <w:r>
           <w:rPr>
             <w:rStyle w:val="Hyperlink"/>
@@ -14350,7 +13966,7 @@
       <w:r>
         <w:t xml:space="preserve">Wang, J., and Schmidt, J. C. (2020). "Stream flow and Losses of the Colorado River in the Southern Colorado Plateau." Center for Colorado River Studies, Utah State University, Logan, Utah. </w:t>
       </w:r>
-      <w:hyperlink r:id="rId50" w:history="1">
+      <w:hyperlink r:id="rId49" w:history="1">
         <w:r>
           <w:rPr>
             <w:rStyle w:val="Hyperlink"/>
@@ -14369,6 +13985,7 @@
         <w:ind w:left="720" w:hanging="720"/>
       </w:pPr>
       <w:r>
+        <w:lastRenderedPageBreak/>
         <w:t xml:space="preserve">Yates, D., Sieber, J., Purkey, D., and Huber-Lee, A. (2005). "WEAP21 - A demand-, priority-, and preference-driven water planning model Part 1: Model characteristics." </w:t>
       </w:r>
       <w:r>
@@ -14380,7 +13997,7 @@
       <w:r>
         <w:t xml:space="preserve">, 30(4), 487-500. </w:t>
       </w:r>
-      <w:hyperlink r:id="rId51" w:history="1">
+      <w:hyperlink r:id="rId50" w:history="1">
         <w:r>
           <w:rPr>
             <w:rStyle w:val="Hyperlink"/>
@@ -14409,7 +14026,7 @@
       <w:r>
         <w:t xml:space="preserve">, 37(4), 913-929. </w:t>
       </w:r>
-      <w:hyperlink r:id="rId52" w:history="1">
+      <w:hyperlink r:id="rId51" w:history="1">
         <w:r>
           <w:rPr>
             <w:rStyle w:val="Hyperlink"/>
@@ -14439,7 +14056,7 @@
       </w:r>
     </w:p>
     <w:sectPr>
-      <w:headerReference w:type="default" r:id="rId53"/>
+      <w:headerReference w:type="default" r:id="rId52"/>
       <w:pgSz w:w="12240" w:h="15840"/>
       <w:pgMar w:top="1440" w:right="1440" w:bottom="1440" w:left="1440" w:header="720" w:footer="720" w:gutter="0"/>
       <w:cols w:space="720"/>

</xml_diff>

<commit_message>
Switch historical plots to download.
</commit_message>
<xml_diff>
--- a/LakeMeadWaterConservationProgramAnalysis/LakeMeadWaterConservationProgramSuccessChallengesSuggestions_v2.docx
+++ b/LakeMeadWaterConservationProgramAnalysis/LakeMeadWaterConservationProgramSuccessChallengesSuggestions_v2.docx
@@ -13,16 +13,6 @@
           <w:szCs w:val="28"/>
         </w:rPr>
       </w:pPr>
-      <w:r>
-        <w:rPr>
-          <w:rFonts w:asciiTheme="majorBidi" w:hAnsiTheme="majorBidi" w:cstheme="majorBidi"/>
-          <w:b/>
-          <w:bCs/>
-          <w:sz w:val="28"/>
-          <w:szCs w:val="28"/>
-        </w:rPr>
-        <w:t xml:space="preserve">The </w:t>
-      </w:r>
       <w:r>
         <w:rPr>
           <w:rFonts w:asciiTheme="majorBidi" w:hAnsiTheme="majorBidi" w:cstheme="majorBidi"/>
@@ -921,16 +911,10 @@
         </w:numPr>
       </w:pPr>
       <w:r>
-        <w:t xml:space="preserve">How to improve program sustainability </w:t>
-      </w:r>
-      <w:r>
-        <w:t>in the face of</w:t>
-      </w:r>
-      <w:r>
-        <w:t xml:space="preserve"> aridity </w:t>
-      </w:r>
-      <w:r>
-        <w:t>while give users more autonomy to manage their differing and sometimes conflicting risks of water shortages</w:t>
+        <w:t>How to give users more autonomy to manage their differing and sometimes conflicting risks of water shortages</w:t>
+      </w:r>
+      <w:r>
+        <w:t xml:space="preserve"> in the face of aridity</w:t>
       </w:r>
       <w:r>
         <w:t>?</w:t>
@@ -4869,39 +4853,7 @@
           <w:sz w:val="24"/>
           <w:szCs w:val="24"/>
         </w:rPr>
-        <w:t xml:space="preserve"> described</w:t>
-      </w:r>
-      <w:r>
-        <w:rPr>
-          <w:rFonts w:asciiTheme="majorBidi" w:hAnsiTheme="majorBidi" w:cstheme="majorBidi"/>
-          <w:sz w:val="24"/>
-          <w:szCs w:val="24"/>
-        </w:rPr>
-        <w:t xml:space="preserve"> a parallel</w:t>
-      </w:r>
-      <w:r>
-        <w:rPr>
-          <w:rFonts w:asciiTheme="majorBidi" w:hAnsiTheme="majorBidi" w:cstheme="majorBidi"/>
-          <w:sz w:val="24"/>
-          <w:szCs w:val="24"/>
-        </w:rPr>
-        <w:t xml:space="preserve"> mandatory Lake Mead water use reduction (shortage) program for Lower Basin users</w:t>
-      </w:r>
-      <w:r>
-        <w:rPr>
-          <w:rFonts w:asciiTheme="majorBidi" w:hAnsiTheme="majorBidi" w:cstheme="majorBidi"/>
-          <w:sz w:val="24"/>
-          <w:szCs w:val="24"/>
-        </w:rPr>
-        <w:t xml:space="preserve"> </w:t>
-      </w:r>
-      <w:r>
-        <w:rPr>
-          <w:rFonts w:asciiTheme="majorBidi" w:hAnsiTheme="majorBidi" w:cstheme="majorBidi"/>
-          <w:sz w:val="24"/>
-          <w:szCs w:val="24"/>
-        </w:rPr>
-        <w:t xml:space="preserve">introduced in the Interim Guidelines and expanded in the Lower Basin Drought Contingency Plan </w:t>
+        <w:t xml:space="preserve"> described a parallel mandatory Lake Mead water use reduction (shortage) program for Lower Basin users introduced in the Interim Guidelines and expanded in the Lower Basin Drought Contingency Plan </w:t>
       </w:r>
       <w:r>
         <w:rPr>
@@ -4950,31 +4902,7 @@
           <w:sz w:val="24"/>
           <w:szCs w:val="24"/>
         </w:rPr>
-        <w:t xml:space="preserve">. </w:t>
-      </w:r>
-      <w:r>
-        <w:rPr>
-          <w:rFonts w:asciiTheme="majorBidi" w:hAnsiTheme="majorBidi" w:cstheme="majorBidi"/>
-          <w:sz w:val="24"/>
-          <w:szCs w:val="24"/>
-        </w:rPr>
-        <w:t>M</w:t>
-      </w:r>
-      <w:r>
-        <w:rPr>
-          <w:rFonts w:asciiTheme="majorBidi" w:hAnsiTheme="majorBidi" w:cstheme="majorBidi"/>
-          <w:sz w:val="24"/>
-          <w:szCs w:val="24"/>
-        </w:rPr>
-        <w:t>andatory water shortages increase as Lake Mead’s level declines from elevation 1,090 to 1,020 feet.</w:t>
-      </w:r>
-      <w:r>
-        <w:rPr>
-          <w:rFonts w:asciiTheme="majorBidi" w:hAnsiTheme="majorBidi" w:cstheme="majorBidi"/>
-          <w:sz w:val="24"/>
-          <w:szCs w:val="24"/>
-        </w:rPr>
-        <w:t xml:space="preserve"> Nonetheless, t</w:t>
+        <w:t>. Mandatory water shortages increase as Lake Mead’s level declines from elevation 1,090 to 1,020 feet. Nonetheless, t</w:t>
       </w:r>
       <w:r>
         <w:rPr>
@@ -5063,121 +4991,6 @@
           <w:szCs w:val="24"/>
         </w:rPr>
         <w:t>.</w:t>
-      </w:r>
-    </w:p>
-    <w:p>
-      <w:pPr>
-        <w:rPr>
-          <w:rFonts w:asciiTheme="majorBidi" w:hAnsiTheme="majorBidi" w:cstheme="majorBidi"/>
-          <w:sz w:val="24"/>
-          <w:szCs w:val="24"/>
-        </w:rPr>
-      </w:pPr>
-      <w:r>
-        <w:rPr>
-          <w:rFonts w:asciiTheme="majorBidi" w:hAnsiTheme="majorBidi" w:cstheme="majorBidi"/>
-          <w:b/>
-          <w:bCs/>
-          <w:sz w:val="24"/>
-          <w:szCs w:val="24"/>
-        </w:rPr>
-        <w:t xml:space="preserve">Program sustainability - </w:t>
-      </w:r>
-      <w:r>
-        <w:rPr>
-          <w:rFonts w:asciiTheme="majorBidi" w:hAnsiTheme="majorBidi" w:cstheme="majorBidi"/>
-          <w:sz w:val="24"/>
-          <w:szCs w:val="24"/>
-        </w:rPr>
-        <w:t xml:space="preserve">The </w:t>
-      </w:r>
-      <w:r>
-        <w:rPr>
-          <w:rFonts w:asciiTheme="majorBidi" w:hAnsiTheme="majorBidi" w:cstheme="majorBidi"/>
-          <w:sz w:val="24"/>
-          <w:szCs w:val="24"/>
-        </w:rPr>
-        <w:t xml:space="preserve">voluntary </w:t>
-      </w:r>
-      <w:r>
-        <w:rPr>
-          <w:rFonts w:asciiTheme="majorBidi" w:hAnsiTheme="majorBidi" w:cstheme="majorBidi"/>
-          <w:sz w:val="24"/>
-          <w:szCs w:val="24"/>
-        </w:rPr>
-        <w:t>water conservation program functions under the assumption that</w:t>
-      </w:r>
-      <w:r>
-        <w:rPr>
-          <w:rFonts w:asciiTheme="majorBidi" w:hAnsiTheme="majorBidi" w:cstheme="majorBidi"/>
-          <w:sz w:val="24"/>
-          <w:szCs w:val="24"/>
-        </w:rPr>
-        <w:t xml:space="preserve"> the annual</w:t>
-      </w:r>
-      <w:r>
-        <w:rPr>
-          <w:rFonts w:asciiTheme="majorBidi" w:hAnsiTheme="majorBidi" w:cstheme="majorBidi"/>
-          <w:sz w:val="24"/>
-          <w:szCs w:val="24"/>
-        </w:rPr>
-        <w:t xml:space="preserve"> Lake Mead inflow minus evaporation</w:t>
-      </w:r>
-      <w:r>
-        <w:rPr>
-          <w:rFonts w:asciiTheme="majorBidi" w:hAnsiTheme="majorBidi" w:cstheme="majorBidi"/>
-          <w:sz w:val="24"/>
-          <w:szCs w:val="24"/>
-        </w:rPr>
-        <w:t>—the annual available water—</w:t>
-      </w:r>
-      <w:r>
-        <w:rPr>
-          <w:rFonts w:asciiTheme="majorBidi" w:hAnsiTheme="majorBidi" w:cstheme="majorBidi"/>
-          <w:sz w:val="24"/>
-          <w:szCs w:val="24"/>
-        </w:rPr>
-        <w:t xml:space="preserve">exceeds the sum of the </w:t>
-      </w:r>
-      <w:r>
-        <w:rPr>
-          <w:rFonts w:asciiTheme="majorBidi" w:hAnsiTheme="majorBidi" w:cstheme="majorBidi"/>
-          <w:sz w:val="24"/>
-          <w:szCs w:val="24"/>
-        </w:rPr>
-        <w:t>legal entitlements</w:t>
-      </w:r>
-      <w:r>
-        <w:rPr>
-          <w:rFonts w:asciiTheme="majorBidi" w:hAnsiTheme="majorBidi" w:cstheme="majorBidi"/>
-          <w:sz w:val="24"/>
-          <w:szCs w:val="24"/>
-        </w:rPr>
-        <w:t xml:space="preserve"> of 9.0 million acre</w:t>
-      </w:r>
-      <w:r>
-        <w:rPr>
-          <w:rFonts w:asciiTheme="majorBidi" w:hAnsiTheme="majorBidi" w:cstheme="majorBidi"/>
-          <w:sz w:val="24"/>
-          <w:szCs w:val="24"/>
-        </w:rPr>
-        <w:t>-</w:t>
-      </w:r>
-      <w:r>
-        <w:rPr>
-          <w:rFonts w:asciiTheme="majorBidi" w:hAnsiTheme="majorBidi" w:cstheme="majorBidi"/>
-          <w:sz w:val="24"/>
-          <w:szCs w:val="24"/>
-        </w:rPr>
-        <w:t>feet per year</w:t>
-      </w:r>
-      <w:r>
-        <w:rPr>
-          <w:rFonts w:asciiTheme="majorBidi" w:hAnsiTheme="majorBidi" w:cstheme="majorBidi"/>
-          <w:sz w:val="24"/>
-          <w:szCs w:val="24"/>
-        </w:rPr>
-        <w:t>. This assumption is challenged as the Colorado River Basin becomes more arid.</w:t>
       </w:r>
     </w:p>
     <w:p>
@@ -5610,7 +5423,6 @@
         <w:rPr>
           <w:noProof/>
         </w:rPr>
-        <w:lastRenderedPageBreak/>
         <w:drawing>
           <wp:inline distT="0" distB="0" distL="0" distR="0" wp14:anchorId="2DE69148" wp14:editId="65965B80">
             <wp:extent cx="3792478" cy="2429050"/>
@@ -5694,6 +5506,7 @@
         <w:rPr>
           <w:noProof/>
         </w:rPr>
+        <w:lastRenderedPageBreak/>
         <w:drawing>
           <wp:inline distT="0" distB="0" distL="0" distR="0" wp14:anchorId="6B526E6E" wp14:editId="38FCE882">
             <wp:extent cx="4989931" cy="3256250"/>
@@ -6130,7 +5943,6 @@
         <w:rPr>
           <w:noProof/>
         </w:rPr>
-        <w:lastRenderedPageBreak/>
         <w:drawing>
           <wp:inline distT="0" distB="0" distL="0" distR="0" wp14:anchorId="1469C920" wp14:editId="5A1F6266">
             <wp:extent cx="5371106" cy="1444345"/>
@@ -6432,6 +6244,7 @@
         <w:rPr>
           <w:noProof/>
         </w:rPr>
+        <w:lastRenderedPageBreak/>
         <w:drawing>
           <wp:inline distT="0" distB="0" distL="0" distR="0" wp14:anchorId="57C79B56" wp14:editId="0FB793FE">
             <wp:extent cx="5943600" cy="4328795"/>
@@ -6567,18 +6380,7 @@
           <w:sz w:val="24"/>
           <w:szCs w:val="24"/>
         </w:rPr>
-        <w:t xml:space="preserve"> </w:t>
-      </w:r>
-      <w:r>
-        <w:rPr>
-          <w:rFonts w:asciiTheme="majorBidi" w:hAnsiTheme="majorBidi" w:cstheme="majorBidi"/>
-          <w:b/>
-          <w:bCs/>
-          <w:sz w:val="24"/>
-          <w:szCs w:val="24"/>
-        </w:rPr>
-        <w:lastRenderedPageBreak/>
-        <w:t>(dashed red line)</w:t>
+        <w:t xml:space="preserve"> (dashed red line)</w:t>
       </w:r>
       <w:r>
         <w:rPr>
@@ -7006,6 +6808,7 @@
           <w:sz w:val="24"/>
           <w:szCs w:val="24"/>
         </w:rPr>
+        <w:lastRenderedPageBreak/>
         <w:t xml:space="preserve">Motivating additional voluntary water conservation is challenging. </w:t>
       </w:r>
       <w:r>
@@ -7671,18 +7474,119 @@
     </w:p>
     <w:p>
       <w:pPr>
-        <w:pStyle w:val="NoSpacing"/>
-      </w:pPr>
-      <w:r>
-        <w:t xml:space="preserve">When a key component that defines the water available for release―reservoir inflow―is not included in the design of a water conservation program, overdraft can occur despite large systemwide storage capacity or decreasing use. In this scenario, Lake Mead would draw down </w:t>
-      </w:r>
-      <w:r>
-        <w:lastRenderedPageBreak/>
-        <w:t>even as states credit their water conservation accounts. This situation occurred over the past decade (Figure 3). This happened when the balance of Lake Mead inflows and evaporation were less than legal entitlements (Figure 4). Essentially, states got credit for voluntary water conservation activity even though the physical water never entered the reservoir. We estimated that 0.8 million acre-feet of the total 4.4 million acre-feet of program conservation efforts were credited even though sufficient water did not flow into Lake Mead (Figure 4).</w:t>
+        <w:rPr>
+          <w:rFonts w:asciiTheme="majorBidi" w:hAnsiTheme="majorBidi" w:cstheme="majorBidi"/>
+          <w:sz w:val="24"/>
+          <w:szCs w:val="24"/>
+        </w:rPr>
+      </w:pPr>
+      <w:r>
+        <w:rPr>
+          <w:rFonts w:asciiTheme="majorBidi" w:hAnsiTheme="majorBidi" w:cstheme="majorBidi"/>
+          <w:sz w:val="24"/>
+          <w:szCs w:val="24"/>
+        </w:rPr>
+        <w:t xml:space="preserve">The </w:t>
+      </w:r>
+      <w:r>
+        <w:rPr>
+          <w:rFonts w:asciiTheme="majorBidi" w:hAnsiTheme="majorBidi" w:cstheme="majorBidi"/>
+          <w:sz w:val="24"/>
+          <w:szCs w:val="24"/>
+        </w:rPr>
+        <w:t xml:space="preserve">voluntary </w:t>
+      </w:r>
+      <w:r>
+        <w:rPr>
+          <w:rFonts w:asciiTheme="majorBidi" w:hAnsiTheme="majorBidi" w:cstheme="majorBidi"/>
+          <w:sz w:val="24"/>
+          <w:szCs w:val="24"/>
+        </w:rPr>
+        <w:t>water conservation program functions under the assumption that</w:t>
+      </w:r>
+      <w:r>
+        <w:rPr>
+          <w:rFonts w:asciiTheme="majorBidi" w:hAnsiTheme="majorBidi" w:cstheme="majorBidi"/>
+          <w:sz w:val="24"/>
+          <w:szCs w:val="24"/>
+        </w:rPr>
+        <w:t xml:space="preserve"> the annual</w:t>
+      </w:r>
+      <w:r>
+        <w:rPr>
+          <w:rFonts w:asciiTheme="majorBidi" w:hAnsiTheme="majorBidi" w:cstheme="majorBidi"/>
+          <w:sz w:val="24"/>
+          <w:szCs w:val="24"/>
+        </w:rPr>
+        <w:t xml:space="preserve"> Lake Mead inflow minus evaporation</w:t>
+      </w:r>
+      <w:r>
+        <w:rPr>
+          <w:rFonts w:asciiTheme="majorBidi" w:hAnsiTheme="majorBidi" w:cstheme="majorBidi"/>
+          <w:sz w:val="24"/>
+          <w:szCs w:val="24"/>
+        </w:rPr>
+        <w:t>—the annual available water—</w:t>
+      </w:r>
+      <w:r>
+        <w:rPr>
+          <w:rFonts w:asciiTheme="majorBidi" w:hAnsiTheme="majorBidi" w:cstheme="majorBidi"/>
+          <w:sz w:val="24"/>
+          <w:szCs w:val="24"/>
+        </w:rPr>
+        <w:t xml:space="preserve">exceeds the sum of the </w:t>
+      </w:r>
+      <w:r>
+        <w:rPr>
+          <w:rFonts w:asciiTheme="majorBidi" w:hAnsiTheme="majorBidi" w:cstheme="majorBidi"/>
+          <w:sz w:val="24"/>
+          <w:szCs w:val="24"/>
+        </w:rPr>
+        <w:t>legal entitlements</w:t>
+      </w:r>
+      <w:r>
+        <w:rPr>
+          <w:rFonts w:asciiTheme="majorBidi" w:hAnsiTheme="majorBidi" w:cstheme="majorBidi"/>
+          <w:sz w:val="24"/>
+          <w:szCs w:val="24"/>
+        </w:rPr>
+        <w:t xml:space="preserve"> of 9.0 million acre</w:t>
+      </w:r>
+      <w:r>
+        <w:rPr>
+          <w:rFonts w:asciiTheme="majorBidi" w:hAnsiTheme="majorBidi" w:cstheme="majorBidi"/>
+          <w:sz w:val="24"/>
+          <w:szCs w:val="24"/>
+        </w:rPr>
+        <w:t>-</w:t>
+      </w:r>
+      <w:r>
+        <w:rPr>
+          <w:rFonts w:asciiTheme="majorBidi" w:hAnsiTheme="majorBidi" w:cstheme="majorBidi"/>
+          <w:sz w:val="24"/>
+          <w:szCs w:val="24"/>
+        </w:rPr>
+        <w:t>feet per year</w:t>
+      </w:r>
+      <w:r>
+        <w:rPr>
+          <w:rFonts w:asciiTheme="majorBidi" w:hAnsiTheme="majorBidi" w:cstheme="majorBidi"/>
+          <w:sz w:val="24"/>
+          <w:szCs w:val="24"/>
+        </w:rPr>
+        <w:t>. This assumption is challenged as the Colorado River Basin becomes more arid.</w:t>
       </w:r>
     </w:p>
     <w:p>
       <w:pPr>
+        <w:pStyle w:val="NoSpacing"/>
+      </w:pPr>
+      <w:r>
+        <w:t>When a key component that defines the water available for release―reservoir inflow―is not included in the design of a water conservation program, overdraft can occur despite large systemwide storage capacity or decreasing use. In this scenario, Lake Mead would draw down even as states credit their water conservation accounts. This situation occurred over the past decade (Figure 3). This happened when the balance of Lake Mead inflows and evaporation were less than legal entitlements (Figure 4). Essentially, states got credit for voluntary water conservation activity even though the physical water never entered the reservoir. We estimated that 0.8 million acre-feet of the total 4.4 million acre-feet of program conservation efforts were credited even though sufficient water did not flow into Lake Mead (Figure 4).</w:t>
+      </w:r>
+    </w:p>
+    <w:p>
+      <w:pPr>
         <w:pStyle w:val="ListParagraph"/>
         <w:rPr>
           <w:rFonts w:asciiTheme="majorBidi" w:hAnsiTheme="majorBidi" w:cstheme="majorBidi"/>
@@ -7694,6 +7598,7 @@
         <w:rPr>
           <w:noProof/>
         </w:rPr>
+        <w:lastRenderedPageBreak/>
         <w:drawing>
           <wp:inline distT="0" distB="0" distL="0" distR="0" wp14:anchorId="1FBC528F" wp14:editId="16B80AE6">
             <wp:extent cx="3831745" cy="2524417"/>
@@ -8628,11 +8533,7 @@
         <w:t>Total</w:t>
       </w:r>
       <w:r>
-        <w:t xml:space="preserve"> even though some or all of that water did not flow into the reservoir. Case #2 will increasingly occur as future flows become more volatile and/or decline. For example, with a total maximum mandatory shortage of 1.5 maf per year as envisioned in Reclamation’s basic coordination alternative, Lake Mead </w:t>
-      </w:r>
-      <w:r>
-        <w:lastRenderedPageBreak/>
-        <w:t xml:space="preserve">inflows below 7.8 maf (corresponding to a Lake Powell release of ~ 8.4 maf per year) will result in problems. Similarly, if the total maximum mandatory shortage is 4.0 maf per year as envisioned in Reclamation’s maximum operational flexibility alternative, Lake Mead inflows below 5.3 maf per year (corresponding to a Lake Powell release of ~ 4.7 maf) will cause problems. For sustainability in Case #2, we should only credit water that physically flowed into the reservoir and can be stored for later release. </w:t>
+        <w:t xml:space="preserve"> even though some or all of that water did not flow into the reservoir. Case #2 will increasingly occur as future flows become more volatile and/or decline. For example, with a total maximum mandatory shortage of 1.5 maf per year as envisioned in Reclamation’s basic coordination alternative, Lake Mead inflows below 7.8 maf (corresponding to a Lake Powell release of ~ 8.4 maf per year) will result in problems. Similarly, if the total maximum mandatory shortage is 4.0 maf per year as envisioned in Reclamation’s maximum operational flexibility alternative, Lake Mead inflows below 5.3 maf per year (corresponding to a Lake Powell release of ~ 4.7 maf) will cause problems. For sustainability in Case #2, we should only credit water that physically flowed into the reservoir and can be stored for later release. </w:t>
       </w:r>
       <w:r>
         <w:t>Never allow total annual</w:t>
@@ -8973,11 +8874,6 @@
     </w:p>
     <w:p>
       <w:pPr>
-        <w:pStyle w:val="NoSpacing"/>
-      </w:pPr>
-    </w:p>
-    <w:p>
-      <w:pPr>
         <w:pStyle w:val="Heading1"/>
       </w:pPr>
       <w:r>
@@ -9394,6 +9290,13 @@
           <w:szCs w:val="24"/>
         </w:rPr>
         <w:fldChar w:fldCharType="end"/>
+      </w:r>
+      <w:r>
+        <w:rPr>
+          <w:rFonts w:asciiTheme="majorBidi" w:hAnsiTheme="majorBidi" w:cstheme="majorBidi"/>
+          <w:sz w:val="24"/>
+          <w:szCs w:val="24"/>
+        </w:rPr>
       </w:r>
       <w:r>
         <w:rPr>
@@ -9580,6 +9483,13 @@
           <w:szCs w:val="24"/>
         </w:rPr>
         <w:fldChar w:fldCharType="end"/>
+      </w:r>
+      <w:r>
+        <w:rPr>
+          <w:rFonts w:asciiTheme="majorBidi" w:hAnsiTheme="majorBidi" w:cstheme="majorBidi"/>
+          <w:sz w:val="24"/>
+          <w:szCs w:val="24"/>
+        </w:rPr>
       </w:r>
       <w:r>
         <w:rPr>
@@ -10515,7 +10425,6 @@
         <w:rPr>
           <w:noProof/>
         </w:rPr>
-        <w:lastRenderedPageBreak/>
         <w:drawing>
           <wp:inline distT="0" distB="0" distL="0" distR="0" wp14:anchorId="599AECC0" wp14:editId="5E1A6AD8">
             <wp:extent cx="3853944" cy="2292603"/>
@@ -10673,7 +10582,16 @@
           <w:sz w:val="24"/>
           <w:szCs w:val="24"/>
         </w:rPr>
-        <w:t>between Total Legal Entitlements and the Physical Available Water that the Total Shortage does not fill.</w:t>
+        <w:t xml:space="preserve">between Total Legal Entitlements and the Physical Available Water </w:t>
+      </w:r>
+      <w:r>
+        <w:rPr>
+          <w:rFonts w:asciiTheme="majorBidi" w:hAnsiTheme="majorBidi" w:cstheme="majorBidi"/>
+          <w:sz w:val="24"/>
+          <w:szCs w:val="24"/>
+        </w:rPr>
+        <w:lastRenderedPageBreak/>
+        <w:t>that the Total Shortage does not fill.</w:t>
       </w:r>
       <w:r>
         <w:rPr>
@@ -10803,7 +10721,7 @@
           <w:sz w:val="24"/>
           <w:szCs w:val="24"/>
         </w:rPr>
-        <w:t>sets the protection volume to stabilize and recover Lake Mead storage. This volume defines the Reclamation water account balance. Then i</w:t>
+        <w:t>sets the protection volume to stabilize Lake Mead storage. This volume defines the Reclamation water account balance. Then i</w:t>
       </w:r>
       <w:r>
         <w:rPr>
@@ -11402,6 +11320,14 @@
           <w:sz w:val="24"/>
           <w:szCs w:val="24"/>
         </w:rPr>
+        <w:t>s</w:t>
+      </w:r>
+      <w:r>
+        <w:rPr>
+          <w:rFonts w:asciiTheme="majorBidi" w:hAnsiTheme="majorBidi" w:cstheme="majorBidi"/>
+          <w:sz w:val="24"/>
+          <w:szCs w:val="24"/>
+        </w:rPr>
         <w:t xml:space="preserve">, there is also </w:t>
       </w:r>
       <w:r>
@@ -11722,7 +11648,7 @@
           <w:sz w:val="24"/>
           <w:szCs w:val="24"/>
         </w:rPr>
-        <w:t xml:space="preserve">. </w:t>
+        <w:t xml:space="preserve"> </w:t>
       </w:r>
       <w:r>
         <w:rPr>
@@ -11746,16 +11672,7 @@
           <w:sz w:val="24"/>
           <w:szCs w:val="24"/>
         </w:rPr>
-        <w:t xml:space="preserve">Lake Powell </w:t>
-      </w:r>
-      <w:r>
-        <w:rPr>
-          <w:rFonts w:asciiTheme="majorBidi" w:hAnsiTheme="majorBidi" w:cstheme="majorBidi"/>
-          <w:sz w:val="24"/>
-          <w:szCs w:val="24"/>
-        </w:rPr>
-        <w:lastRenderedPageBreak/>
-        <w:t>release</w:t>
+        <w:t>Lake Powell release</w:t>
       </w:r>
       <w:r>
         <w:rPr>
@@ -12241,7 +12158,16 @@
           <w:sz w:val="24"/>
           <w:szCs w:val="24"/>
         </w:rPr>
-        <w:t xml:space="preserve"> because states and contractors face increasing difficulty to access and debit their </w:t>
+        <w:t xml:space="preserve"> because </w:t>
+      </w:r>
+      <w:r>
+        <w:rPr>
+          <w:rFonts w:asciiTheme="majorBidi" w:hAnsiTheme="majorBidi" w:cstheme="majorBidi"/>
+          <w:sz w:val="24"/>
+          <w:szCs w:val="24"/>
+        </w:rPr>
+        <w:lastRenderedPageBreak/>
+        <w:t xml:space="preserve">states and contractors face increasing difficulty to access and debit their </w:t>
       </w:r>
       <w:r>
         <w:rPr>
@@ -12919,7 +12845,6 @@
         <w:rPr>
           <w:noProof/>
         </w:rPr>
-        <w:lastRenderedPageBreak/>
         <w:drawing>
           <wp:inline distT="0" distB="0" distL="0" distR="0" wp14:anchorId="4CC0DC87" wp14:editId="29FFDDB0">
             <wp:extent cx="3157335" cy="2045508"/>
@@ -13056,6 +12981,7 @@
         <w:rPr>
           <w:noProof/>
         </w:rPr>
+        <w:lastRenderedPageBreak/>
         <w:drawing>
           <wp:inline distT="0" distB="0" distL="0" distR="0" wp14:anchorId="3DFF5439" wp14:editId="46D10C37">
             <wp:extent cx="5943600" cy="1592580"/>
@@ -14063,6 +13989,7 @@
         <w:pStyle w:val="Heading1"/>
       </w:pPr>
       <w:r>
+        <w:lastRenderedPageBreak/>
         <w:t>References</w:t>
       </w:r>
     </w:p>
@@ -14395,7 +14322,6 @@
         <w:ind w:left="720" w:hanging="720"/>
       </w:pPr>
       <w:r>
-        <w:lastRenderedPageBreak/>
         <w:t xml:space="preserve">Hegwood, M., Langendorf, R. E., and Burgess, M. G. (2022). "Why win–wins are rare in complex environmental management." </w:t>
       </w:r>
       <w:r>
@@ -14515,6 +14441,7 @@
         <w:ind w:left="720" w:hanging="720"/>
       </w:pPr>
       <w:r>
+        <w:lastRenderedPageBreak/>
         <w:t xml:space="preserve">Meehan, K., Jepson, W., Harris, L. M., Wutich, A., Beresford, M., Fencl, A., London, J., Pierce, G., Radonic, L., Wells, C., Wilson, N. J., Adams, E. A., Arsenault, R., Brewis, A., Harrington, V., Lambrinidou, Y., McGregor, D., Patrick, R., Pauli, B., Pearson, A. L., Shah, S., Splichalova, D., Workman, C., and Young, S. (2020). "Exposing the myths of household water insecurity in the global north: A critical review." </w:t>
       </w:r>
       <w:r>
@@ -14786,7 +14713,6 @@
         <w:ind w:left="720" w:hanging="720"/>
       </w:pPr>
       <w:r>
-        <w:lastRenderedPageBreak/>
         <w:t xml:space="preserve">Stelter, D. (2022). "Towards a Utah Intentionally Created Surplus Program." </w:t>
       </w:r>
       <w:r>
@@ -14877,6 +14803,7 @@
         <w:ind w:left="720" w:hanging="720"/>
       </w:pPr>
       <w:r>
+        <w:lastRenderedPageBreak/>
         <w:t xml:space="preserve">UCRC. (2024). "Colorado River System Conservation Pilot Program in the Upper Colorado River Basin." </w:t>
       </w:r>
       <w:r>
@@ -18394,6 +18321,7 @@
   <w:style w:type="character" w:default="1" w:styleId="DefaultParagraphFont">
     <w:name w:val="Default Paragraph Font"/>
     <w:uiPriority w:val="1"/>
+    <w:semiHidden/>
     <w:unhideWhenUsed/>
   </w:style>
   <w:style w:type="table" w:default="1" w:styleId="TableNormal">

</xml_diff>